<commit_message>
Style the tables and drop the section rules
Pandoc emits tables with no borders and lets their cells inherit the
double line spacing set on the body, so they read as unformatted blocks
towering over the text. They now use the three-rule convention of printed
tables -- a rule above the header, one below it, one under the last row,
no vertical or interior lines -- with cell padding, bold headers, and the
body single-spaced at 10pt.

The horizontal rules that separated sections in the markdown are removed
at source. Pandoc draws each as a picture, which is why they survived as
apparently empty paragraphs; in a manuscript the headings already do that
job.

polish_docx.py now also audits the built file and reports font sizes, line
spacings and blank paragraphs that differ from the body style, so a stray
size or spacing shows up rather than reaching a reviewer.

Co-Authored-By: Claude Opus 5 (1M context) <noreply@anthropic.com>
</commit_message>
<xml_diff>
--- a/submission_jnm/highlights.docx
+++ b/submission_jnm/highlights.docx
@@ -71,7 +71,6 @@
       </w:r>
     </w:p>
     <w:sectPr>
-      <w:footerReference w:type="default" r:id="rId9"/>
       <w:footnotePr>
         <w:numRestart w:val="eachSect"/>
       </w:footnotePr>
@@ -83,26 +82,6 @@
 
 <file path=word/comments.xml><?xml version="1.0" encoding="utf-8"?>
 <w:comments xmlns:w="http://schemas.openxmlformats.org/wordprocessingml/2006/main" xmlns:m="http://schemas.openxmlformats.org/officeDocument/2006/math" xmlns:r="http://schemas.openxmlformats.org/officeDocument/2006/relationships" xmlns:o="urn:schemas-microsoft-com:office:office" xmlns:v="urn:schemas-microsoft-com:vml" xmlns:w10="urn:schemas-microsoft-com:office:word" xmlns:a="http://schemas.openxmlformats.org/drawingml/2006/main" xmlns:pic="http://schemas.openxmlformats.org/drawingml/2006/picture" xmlns:wp="http://schemas.openxmlformats.org/drawingml/2006/wordprocessingDrawing"/>
-</file>
-
-<file path=word/footer1.xml><?xml version="1.0" encoding="utf-8"?>
-<w:ftr xmlns:m="http://schemas.openxmlformats.org/officeDocument/2006/math" xmlns:mc="http://schemas.openxmlformats.org/markup-compatibility/2006" xmlns:mo="http://schemas.microsoft.com/office/mac/office/2008/main" xmlns:mv="urn:schemas-microsoft-com:mac:vml" xmlns:o="urn:schemas-microsoft-com:office:office" xmlns:r="http://schemas.openxmlformats.org/officeDocument/2006/relationships" xmlns:v="urn:schemas-microsoft-com:vml" xmlns:w10="urn:schemas-microsoft-com:office:word" xmlns:w14="http://schemas.microsoft.com/office/word/2010/wordml" xmlns:w="http://schemas.openxmlformats.org/wordprocessingml/2006/main" xmlns:wne="http://schemas.microsoft.com/office/word/2006/wordml" xmlns:wp14="http://schemas.microsoft.com/office/word/2010/wordprocessingDrawing" xmlns:wp="http://schemas.openxmlformats.org/drawingml/2006/wordprocessingDrawing" xmlns:wpc="http://schemas.microsoft.com/office/word/2010/wordprocessingCanvas" xmlns:wpg="http://schemas.microsoft.com/office/word/2010/wordprocessingGroup" xmlns:wpi="http://schemas.microsoft.com/office/word/2010/wordprocessingInk" xmlns:wps="http://schemas.microsoft.com/office/word/2010/wordprocessingShape" mc:Ignorable="w14 wp14">
-  <w:p>
-    <w:pPr>
-      <w:pStyle w:val="Footer"/>
-      <w:jc w:val="center"/>
-    </w:pPr>
-    <w:r>
-      <w:rPr>
-        <w:rFonts w:ascii="Times New Roman" w:hAnsi="Times New Roman"/>
-        <w:sz w:val="20"/>
-      </w:rPr>
-      <w:fldChar w:fldCharType="begin"/>
-      <w:instrText xml:space="preserve"> PAGE </w:instrText>
-      <w:fldChar w:fldCharType="end"/>
-    </w:r>
-  </w:p>
-</w:ftr>
 </file>
 
 <file path=word/footnotes.xml><?xml version="1.0" encoding="utf-8"?>
@@ -336,7 +315,7 @@
     <w:name w:val="Normal"/>
     <w:qFormat/>
     <w:pPr>
-      <w:spacing w:line="480" w:lineRule="auto" w:after="0"/>
+      <w:spacing w:line="360" w:lineRule="auto"/>
     </w:pPr>
     <w:rPr>
       <w:rFonts w:ascii="Times New Roman" w:hAnsi="Times New Roman" w:eastAsia="Times New Roman"/>
@@ -538,10 +517,9 @@
       <w:outlineLvl w:val="1"/>
     </w:pPr>
     <w:rPr>
-      <w:rFonts w:asciiTheme="majorHAnsi" w:cstheme="majorBidi" w:eastAsiaTheme="majorEastAsia" w:hAnsiTheme="majorHAnsi" w:ascii="Times New Roman" w:hAnsi="Times New Roman"/>
-      <w:b/>
+      <w:rFonts w:asciiTheme="majorHAnsi" w:cstheme="majorBidi" w:eastAsiaTheme="majorEastAsia" w:hAnsiTheme="majorHAnsi"/>
       <w:color w:themeColor="accent1" w:themeShade="BF" w:val="0F4761"/>
-      <w:sz w:val="24"/>
+      <w:sz w:val="32"/>
       <w:szCs w:val="32"/>
     </w:rPr>
   </w:style>
@@ -562,10 +540,9 @@
       <w:outlineLvl w:val="2"/>
     </w:pPr>
     <w:rPr>
-      <w:rFonts w:cstheme="majorBidi" w:eastAsiaTheme="majorEastAsia" w:ascii="Times New Roman" w:hAnsi="Times New Roman"/>
-      <w:b/>
+      <w:rFonts w:cstheme="majorBidi" w:eastAsiaTheme="majorEastAsia"/>
       <w:color w:themeColor="accent1" w:themeShade="BF" w:val="0F4761"/>
-      <w:sz w:val="24"/>
+      <w:sz w:val="28"/>
       <w:szCs w:val="28"/>
     </w:rPr>
   </w:style>
@@ -586,12 +563,10 @@
       <w:outlineLvl w:val="3"/>
     </w:pPr>
     <w:rPr>
-      <w:rFonts w:cstheme="majorBidi" w:eastAsiaTheme="majorEastAsia" w:ascii="Times New Roman" w:hAnsi="Times New Roman"/>
-      <w:b/>
+      <w:rFonts w:cstheme="majorBidi" w:eastAsiaTheme="majorEastAsia"/>
       <w:i/>
       <w:iCs/>
       <w:color w:themeColor="accent1" w:themeShade="BF" w:val="0F4761"/>
-      <w:sz w:val="24"/>
     </w:rPr>
   </w:style>
   <w:style w:styleId="Heading5" w:type="paragraph">

</xml_diff>